<commit_message>
Updated DebugWidgets assignment for 2026
</commit_message>
<xml_diff>
--- a/DebugWidgets/README.docx
+++ b/DebugWidgets/README.docx
@@ -124,7 +124,7 @@
           <w:b/>
           <w:bCs/>
         </w:rPr>
-        <w:t>2</w:t>
+        <w:t>6</w:t>
       </w:r>
       <w:r>
         <w:rPr>
@@ -138,7 +138,7 @@
           <w:b/>
           <w:bCs/>
         </w:rPr>
-        <w:t>6</w:t>
+        <w:t>4</w:t>
       </w:r>
       <w:r>
         <w:rPr>
@@ -481,6 +481,52 @@
       </w:pPr>
       <w:r>
         <w:t>While it’s loading, check Unity’s loading screen to make sure that it’s running the class version of unity (see above)</w:t>
+      </w:r>
+    </w:p>
+    <w:p>
+      <w:pPr>
+        <w:pStyle w:val="ListParagraph"/>
+        <w:numPr>
+          <w:ilvl w:val="1"/>
+          <w:numId w:val="17"/>
+        </w:numPr>
+      </w:pPr>
+      <w:r>
+        <w:t xml:space="preserve">Unity is likely to complain that the </w:t>
+      </w:r>
+      <w:r>
+        <w:rPr>
+          <w:b/>
+          <w:bCs/>
+        </w:rPr>
+        <w:t xml:space="preserve">Input </w:t>
+      </w:r>
+      <w:r>
+        <w:rPr>
+          <w:b/>
+          <w:bCs/>
+        </w:rPr>
+        <w:t>Manager</w:t>
+      </w:r>
+      <w:r>
+        <w:rPr>
+          <w:b/>
+          <w:bCs/>
+        </w:rPr>
+        <w:t xml:space="preserve"> is being deprecated</w:t>
+      </w:r>
+      <w:r>
+        <w:t xml:space="preserve"> and to convert to the new input system.  </w:t>
+      </w:r>
+      <w:r>
+        <w:rPr>
+          <w:b/>
+          <w:bCs/>
+        </w:rPr>
+        <w:t>Ignore that message</w:t>
+      </w:r>
+      <w:r>
+        <w:t>.</w:t>
       </w:r>
     </w:p>
     <w:p>
@@ -1104,15 +1150,15 @@
     </w:p>
     <w:p>
       <w:r>
-        <w:t xml:space="preserve">Each of these is implemented as a component and placed in its own game object.  The reason for putting it in its own game object is so that it has its own </w:t>
+        <w:t xml:space="preserve">Each of these is implemented as a component and placed in its own game object.  The reason for putting it in its own game object is </w:t>
       </w:r>
       <w:proofErr w:type="gramStart"/>
       <w:r>
-        <w:t>transform</w:t>
+        <w:t>so that</w:t>
       </w:r>
       <w:proofErr w:type="gramEnd"/>
       <w:r>
-        <w:t xml:space="preserve">, </w:t>
+        <w:t xml:space="preserve"> it has its own transform, </w:t>
       </w:r>
       <w:r>
         <w:t xml:space="preserve">allowing you to </w:t>
@@ -1517,15 +1563,7 @@
       </w:r>
       <w:proofErr w:type="gramEnd"/>
       <w:r>
-        <w:t xml:space="preserve"> it’s not really doing anything.  </w:t>
-      </w:r>
-      <w:proofErr w:type="gramStart"/>
-      <w:r>
-        <w:t>It’s there</w:t>
-      </w:r>
-      <w:proofErr w:type="gramEnd"/>
-      <w:r>
-        <w:t xml:space="preserve"> largely because Unity always makes one for a UI element.</w:t>
+        <w:t xml:space="preserve"> it’s not really doing anything.  It’s there largely because Unity always makes one for a UI element.</w:t>
       </w:r>
     </w:p>
     <w:p>
@@ -2383,15 +2421,7 @@
       </w:r>
       <w:proofErr w:type="gramEnd"/>
       <w:r>
-        <w:t xml:space="preserve"> the real position that’s stored in the </w:t>
-      </w:r>
-      <w:proofErr w:type="gramStart"/>
-      <w:r>
-        <w:t>transform</w:t>
-      </w:r>
-      <w:proofErr w:type="gramEnd"/>
-      <w:r>
-        <w:t xml:space="preserve"> is </w:t>
+        <w:t xml:space="preserve"> the real position that’s stored in the transform is </w:t>
       </w:r>
       <w:proofErr w:type="gramStart"/>
       <w:r>
@@ -2992,21 +3022,13 @@
         <w:t xml:space="preserve">Because different controllers map functionality to different </w:t>
       </w:r>
       <w:r>
-        <w:t xml:space="preserve">joystick and button numbers, it’s a bad idea to </w:t>
-      </w:r>
-      <w:proofErr w:type="gramStart"/>
-      <w:r>
-        <w:t>hard</w:t>
+        <w:t>joystick and button numbers, it’s a bad idea to hard</w:t>
       </w:r>
       <w:r>
         <w:t>-</w:t>
       </w:r>
       <w:r>
-        <w:t>code</w:t>
-      </w:r>
-      <w:proofErr w:type="gramEnd"/>
-      <w:r>
-        <w:t xml:space="preserve"> such numbers into your game logic.  Instead, Unity lets you specify a set of abstract controls, called “virtual axes” in their documentation, that are named with strings.  You can then ask for the current value of a given virtual axis by calling the </w:t>
+        <w:t xml:space="preserve">code such numbers into your game logic.  Instead, Unity lets you specify a set of abstract controls, called “virtual axes” in their documentation, that are named with strings.  You can then ask for the current value of a given virtual axis by calling the </w:t>
       </w:r>
       <w:proofErr w:type="spellStart"/>
       <w:r>
@@ -3139,7 +3161,14 @@
     </w:p>
     <w:p>
       <w:r>
-        <w:t xml:space="preserve">Open the project in Unity.  Remember to open the </w:t>
+        <w:rPr>
+          <w:b/>
+          <w:bCs/>
+        </w:rPr>
+        <w:t>Open the project in Unity</w:t>
+      </w:r>
+      <w:r>
+        <w:t xml:space="preserve">.  Remember to open the </w:t>
       </w:r>
       <w:r>
         <w:t xml:space="preserve">level </w:t>
@@ -3176,6 +3205,42 @@
     </w:p>
     <w:p>
       <w:r>
+        <w:t xml:space="preserve">Once Unity is running, go to the Assets menu and choose </w:t>
+      </w:r>
+      <w:r>
+        <w:rPr>
+          <w:b/>
+          <w:bCs/>
+        </w:rPr>
+        <w:t>Open C# Project</w:t>
+      </w:r>
+      <w:r>
+        <w:t>.  This will open Rider for you and open the project within Rider.  Do not attempt to edit the C# files without first opening the project or Rider will be confused.</w:t>
+      </w:r>
+    </w:p>
+    <w:p>
+      <w:r>
+        <w:t xml:space="preserve">Finally, open </w:t>
+      </w:r>
+      <w:proofErr w:type="spellStart"/>
+      <w:r>
+        <w:t>BarGraph.cs</w:t>
+      </w:r>
+      <w:proofErr w:type="spellEnd"/>
+      <w:r>
+        <w:t xml:space="preserve">, e.g. by double-clicking on </w:t>
+      </w:r>
+      <w:proofErr w:type="spellStart"/>
+      <w:r>
+        <w:t>BarGraph.cs</w:t>
+      </w:r>
+      <w:proofErr w:type="spellEnd"/>
+      <w:r>
+        <w:t xml:space="preserve"> in the Unity Editor’s Project window, or by selecting it directly in Rider.</w:t>
+      </w:r>
+    </w:p>
+    <w:p>
+      <w:r>
         <w:rPr>
           <w:b/>
           <w:bCs/>
@@ -3208,36 +3273,6 @@
       <w:proofErr w:type="spellEnd"/>
       <w:r>
         <w:t>, your peer reviewers will probably not be able to run your code.  You could easily get a zero for the assignment this way.</w:t>
-      </w:r>
-    </w:p>
-    <w:p>
-      <w:r>
-        <w:t xml:space="preserve">Now open </w:t>
-      </w:r>
-      <w:proofErr w:type="spellStart"/>
-      <w:r>
-        <w:t>BarGraph.cs</w:t>
-      </w:r>
-      <w:proofErr w:type="spellEnd"/>
-      <w:r>
-        <w:t xml:space="preserve">, e.g. by </w:t>
-      </w:r>
-      <w:r>
-        <w:t xml:space="preserve">double-clicking on </w:t>
-      </w:r>
-      <w:proofErr w:type="spellStart"/>
-      <w:r>
-        <w:t>BarGraph.cs</w:t>
-      </w:r>
-      <w:proofErr w:type="spellEnd"/>
-      <w:r>
-        <w:t xml:space="preserve"> in the Unity Editor’s Project window</w:t>
-      </w:r>
-      <w:r>
-        <w:t>, or by selecting it directly in Rider (you can open Rider by doing Assets&gt;Open C# Project in the Unity meu)</w:t>
-      </w:r>
-      <w:r>
-        <w:t>.</w:t>
       </w:r>
     </w:p>
     <w:p>
@@ -3330,21 +3365,29 @@
       </w:r>
       <w:r>
         <w:br/>
-        <w:t xml:space="preserve">This should keep a table of the widgets </w:t>
-      </w:r>
-      <w:proofErr w:type="gramStart"/>
-      <w:r>
-        <w:t>its</w:t>
-      </w:r>
-      <w:proofErr w:type="gramEnd"/>
-      <w:r>
-        <w:t xml:space="preserve"> already made and return the widget if it’s already been created, otherwise create it and add it to the table.  </w:t>
+        <w:t>This should keep a table of the widgets it</w:t>
+      </w:r>
+      <w:r>
+        <w:t>’</w:t>
+      </w:r>
+      <w:r>
+        <w:t xml:space="preserve">s already made and return the widget if it’s already been created, otherwise create it and add it to the table.  </w:t>
       </w:r>
       <w:r>
         <w:t>Once you’ve written this, you can try running the game.  The widgets should appear on the screen, even if they aren’t updating yet.</w:t>
       </w:r>
       <w:r>
-        <w:t xml:space="preserve">  However, remember to set the Aspect Ratio to “Full HD”.</w:t>
+        <w:t xml:space="preserve">  However, </w:t>
+      </w:r>
+      <w:r>
+        <w:rPr>
+          <w:i/>
+          <w:iCs/>
+        </w:rPr>
+        <w:t>remember to set the Aspect Ratio to “Full HD”</w:t>
+      </w:r>
+      <w:r>
+        <w:t>.</w:t>
       </w:r>
     </w:p>
     <w:p>
@@ -3498,18 +3541,10 @@
         <w:br/>
       </w:r>
       <w:r>
-        <w:t xml:space="preserve">This should </w:t>
-      </w:r>
-      <w:proofErr w:type="gramStart"/>
-      <w:r>
-        <w:t>c</w:t>
-      </w:r>
-      <w:r>
-        <w:t>hanges</w:t>
-      </w:r>
-      <w:proofErr w:type="gramEnd"/>
-      <w:r>
-        <w:t xml:space="preserve"> the width of the bar to the specified percentage of its maximum width.  </w:t>
+        <w:t>This should c</w:t>
+      </w:r>
+      <w:r>
+        <w:t xml:space="preserve">hange the width of the bar to the specified percentage of its maximum width.  </w:t>
       </w:r>
       <w:r>
         <w:t xml:space="preserve">It should also </w:t>
@@ -3608,6 +3643,7 @@
         </w:numPr>
       </w:pPr>
       <w:r>
+        <w:lastRenderedPageBreak/>
         <w:t xml:space="preserve">The </w:t>
       </w:r>
       <w:r>
@@ -3658,7 +3694,6 @@
         </w:numPr>
       </w:pPr>
       <w:r>
-        <w:lastRenderedPageBreak/>
         <w:t xml:space="preserve">The color should be red if </w:t>
       </w:r>
       <w:r>
@@ -3851,42 +3886,52 @@
     </w:p>
     <w:p>
       <w:r>
-        <w:t xml:space="preserve">Now make sure </w:t>
+        <w:t>Now make sure you</w:t>
+      </w:r>
+      <w:r>
+        <w:t>r</w:t>
+      </w:r>
+      <w:r>
+        <w:t xml:space="preserve"> code doesn’t have any errors in it.</w:t>
+      </w:r>
+    </w:p>
+    <w:p>
+      <w:r>
+        <w:t xml:space="preserve">First, let’s make sure it compiles without any warnings.  In </w:t>
+      </w:r>
+      <w:r>
+        <w:t>Rider</w:t>
+      </w:r>
+      <w:r>
+        <w:t>, choose Build&gt;Rebuild Solution from the menu and make sure the error list at the bottom of the window doesn’t have any errors or compiler warnings.</w:t>
+      </w:r>
+      <w:r>
+        <w:t xml:space="preserve">  If it says something about line endings or “CR” or “LF”, ignore it; that doesn’t count.</w:t>
+      </w:r>
+    </w:p>
+    <w:p>
+      <w:r>
+        <w:t xml:space="preserve">Now go to the Unity window and find the Unity “Console”.  You’ll find it in the Console tab </w:t>
       </w:r>
       <w:proofErr w:type="gramStart"/>
       <w:r>
-        <w:t>you</w:t>
+        <w:t>in</w:t>
       </w:r>
       <w:proofErr w:type="gramEnd"/>
       <w:r>
-        <w:t xml:space="preserve"> code doesn’t have any errors in it.</w:t>
-      </w:r>
-    </w:p>
-    <w:p>
-      <w:r>
-        <w:t xml:space="preserve">First, let’s make sure it compiles without any warnings.  In </w:t>
-      </w:r>
-      <w:r>
-        <w:t>Rider</w:t>
-      </w:r>
-      <w:r>
-        <w:t>, choose Build&gt;Rebuild Solution from the menu and make sure the error list at the bottom of the window doesn’t have any errors or compiler warnings.</w:t>
-      </w:r>
-      <w:r>
-        <w:t xml:space="preserve">  If it says something about line endings or “CR” or “LF”, ignore it; that doesn’t count.</w:t>
-      </w:r>
-    </w:p>
-    <w:p>
-      <w:r>
-        <w:t xml:space="preserve">Now go to the Unity window and find the Unity “Console”.  You’ll find it in the Console tab </w:t>
-      </w:r>
-      <w:proofErr w:type="gramStart"/>
-      <w:r>
-        <w:t>in</w:t>
-      </w:r>
-      <w:proofErr w:type="gramEnd"/>
-      <w:r>
-        <w:t xml:space="preserve"> the bottom pane of the window.  This is where exceptions get printed if your code throws and exception.  You can also display messages here manually using Unity’s </w:t>
+        <w:t xml:space="preserve"> the bottom pane of the window.  This is where exception</w:t>
+      </w:r>
+      <w:r>
+        <w:t xml:space="preserve"> messages</w:t>
+      </w:r>
+      <w:r>
+        <w:t xml:space="preserve"> get printed if your code throws </w:t>
+      </w:r>
+      <w:r>
+        <w:t xml:space="preserve">an </w:t>
+      </w:r>
+      <w:r>
+        <w:t xml:space="preserve">exception.  You can also display messages here manually using Unity’s </w:t>
       </w:r>
       <w:proofErr w:type="spellStart"/>
       <w:r>
@@ -3921,6 +3966,15 @@
       </w:r>
       <w:r>
         <w:t>.</w:t>
+      </w:r>
+      <w:r>
+        <w:t xml:space="preserve">  </w:t>
+      </w:r>
+      <w:r>
+        <w:rPr>
+          <w:color w:val="FFFFFF" w:themeColor="background1"/>
+        </w:rPr>
+        <w:t>Also, be sure to convert any comments and identifiers to Latin.</w:t>
       </w:r>
     </w:p>
     <w:p>

</xml_diff>